<commit_message>
Publish latest neuro-anatomy text and return link
</commit_message>
<xml_diff>
--- a/public/assets/Fondements Neuro-Anatomiques/ROP_v3C_Hub_Fondements_neuro-anatomiques.docx
+++ b/public/assets/Fondements Neuro-Anatomiques/ROP_v3C_Hub_Fondements_neuro-anatomiques.docx
@@ -19,6 +19,39 @@
           <w:lang w:val="fr-FR"/>
         </w:rPr>
         <w:t>Fondements neuro-anatomiques de la R.O.P.</w:t>
+      </w:r>
+    </w:p>
+    <w:p>
+      <w:pPr>
+        <w:spacing w:before="120" w:after="280"/>
+        <w:jc w:val="left"/>
+        <w:rPr>
+          <w:i/>
+          <w:color w:val="5A5A5A"/>
+          <w:sz w:val="22"/>
+          <w:lang w:val="fr-FR"/>
+        </w:rPr>
+      </w:pPr>
+    </w:p>
+    <w:p>
+      <w:pPr>
+        <w:spacing w:before="120" w:after="280"/>
+        <w:jc w:val="left"/>
+        <w:rPr>
+          <w:i/>
+          <w:color w:val="5A5A5A"/>
+          <w:sz w:val="22"/>
+          <w:lang w:val="fr-FR"/>
+        </w:rPr>
+      </w:pPr>
+      <w:r>
+        <w:rPr>
+          <w:i/>
+          <w:color w:val="5A5A5A"/>
+          <w:sz w:val="22"/>
+          <w:lang w:val="fr-FR"/>
+        </w:rPr>
+        <w:t xml:space="preserve">Auteurs : Nicolas Boitout, Guy Boitout </w:t>
       </w:r>
     </w:p>
     <w:p>
@@ -408,7 +441,6 @@
                 <w:sz w:val="20"/>
                 <w:lang w:val="fr-FR"/>
               </w:rPr>
-              <w:lastRenderedPageBreak/>
               <w:t>tronc nerveux</w:t>
             </w:r>
             <w:r>
@@ -781,20 +813,14 @@
           <w:b/>
           <w:lang w:val="fr-FR"/>
         </w:rPr>
+        <w:lastRenderedPageBreak/>
         <w:t>Une entrée du membre inférieur peut modifier une sortie autonome crânienne.</w:t>
       </w:r>
       <w:r>
         <w:rPr>
           <w:lang w:val="fr-FR"/>
         </w:rPr>
-        <w:t xml:space="preserve"> Chez le rat, une stimulation de la patte postérieure recrutant les afférences tibiales et saphènes modifie le diamètre pupillaire ; la réponse disparaît après section du nerf oculomoteur mais persiste après </w:t>
-      </w:r>
-      <w:r>
-        <w:rPr>
-          <w:lang w:val="fr-FR"/>
-        </w:rPr>
-        <w:lastRenderedPageBreak/>
-        <w:t>section des troncs sympathiques cervicaux [43]. C'est le seul trajet documenté où la proximité segmentaire est nulle par construction.</w:t>
+        <w:t xml:space="preserve"> Chez le rat, une stimulation de la patte postérieure recrutant les afférences tibiales et saphènes modifie le diamètre pupillaire ; la réponse disparaît après section du nerf oculomoteur mais persiste après section des troncs sympathiques cervicaux [43]. C'est le seul trajet documenté où la proximité segmentaire est nulle par construction.</w:t>
       </w:r>
     </w:p>
     <w:p>
@@ -1481,6 +1507,7 @@
         <w:rPr>
           <w:lang w:val="fr-FR"/>
         </w:rPr>
+        <w:lastRenderedPageBreak/>
         <w:t>Ces quatre portes peuvent toutes générer une entrée somatique ascendante. La question scientifique n'est donc pas de savoir si une seule zone « communique avec le cerveau », mais si le nerf d'entrée, la branche périphérique et la population afférente recrutée modifient la nature, l'intensité ou la spécificité de la réponse centrale et viscérale.</w:t>
       </w:r>
     </w:p>
@@ -1500,7 +1527,6 @@
           <w:sz w:val="23"/>
           <w:lang w:val="fr-FR"/>
         </w:rPr>
-        <w:lastRenderedPageBreak/>
         <w:t>1.3. Du pied vers le système nerveux central</w:t>
       </w:r>
     </w:p>
@@ -1720,6 +1746,7 @@
           <w:sz w:val="27"/>
           <w:lang w:val="fr-FR"/>
         </w:rPr>
+        <w:lastRenderedPageBreak/>
         <w:t xml:space="preserve">3.  </w:t>
       </w:r>
       <w:r>
@@ -1754,7 +1781,6 @@
         <w:rPr>
           <w:lang w:val="fr-FR"/>
         </w:rPr>
-        <w:lastRenderedPageBreak/>
         <w:t xml:space="preserve">Ces six ponts ne relèvent pas du même type d'argument, et les confondre a longtemps brouillé la discussion. Les </w:t>
       </w:r>
       <w:r>
@@ -1946,21 +1972,7 @@
         <w:rPr>
           <w:lang w:val="fr-FR"/>
         </w:rPr>
-        <w:t xml:space="preserve">Ce raisonnement ne signifie pas qu'une zone cutanée plantaire soit un « dermatome S2 » ou « S3 ». Les cartes </w:t>
-      </w:r>
-      <w:proofErr w:type="spellStart"/>
-      <w:r>
-        <w:rPr>
-          <w:lang w:val="fr-FR"/>
-        </w:rPr>
-        <w:t>dermatomériques</w:t>
-      </w:r>
-      <w:proofErr w:type="spellEnd"/>
-      <w:r>
-        <w:rPr>
-          <w:lang w:val="fr-FR"/>
-        </w:rPr>
-        <w:t xml:space="preserve"> humaines placent surtout L4, L5 et S1 au niveau du membre inférieur distal et du pied [4]. Un dermatome décrit l'origine radiculaire dominante d'un territoire cutané ; un nerf périphérique mixte contient au contraire des axones provenant de plusieurs racines et destinés à la peau, aux muscles, aux articulations et aux tissus profonds.</w:t>
+        <w:t>Ce raisonnement ne signifie pas qu'une zone cutanée plantaire soit un « dermatome S2 » ou « S3 ». Les cartes dermatomériques humaines placent surtout L4, L5 et S1 au niveau du membre inférieur distal et du pied [4]. Un dermatome décrit l'origine radiculaire dominante d'un territoire cutané ; un nerf périphérique mixte contient au contraire des axones provenant de plusieurs racines et destinés à la peau, aux muscles, aux articulations et aux tissus profonds.</w:t>
       </w:r>
     </w:p>
     <w:p>
@@ -1999,7 +2011,14 @@
         <w:rPr>
           <w:lang w:val="fr-FR"/>
         </w:rPr>
-        <w:t>Le Pont 1 doit donc être formulé avec précision : une stimulation d'un territoire tibial peut introduire une activité afférente dans un ensemble lombo-sacré contenant S2–S3 et communiquant avec les circuits pelviens. Elle ne sélectionne pas automatiquement S2 ou S3, ne rejoint pas directement un organe et ne garantit pas une réponse viscérale. Elle apporte cependant un argument de proximité segmentaire plus dense que celui de certaines portes plus lombaires.</w:t>
+        <w:t xml:space="preserve">Le Pont 1 doit donc être formulé avec précision : une stimulation d'un territoire tibial peut introduire une activité afférente dans un ensemble lombo-sacré contenant S2–S3 et communiquant avec les circuits pelviens. Elle ne sélectionne pas automatiquement S2 ou S3, ne rejoint pas directement un organe et </w:t>
+      </w:r>
+      <w:r>
+        <w:rPr>
+          <w:lang w:val="fr-FR"/>
+        </w:rPr>
+        <w:lastRenderedPageBreak/>
+        <w:t>ne garantit pas une réponse viscérale. Elle apporte cependant un argument de proximité segmentaire plus dense que celui de certaines portes plus lombaires.</w:t>
       </w:r>
     </w:p>
     <w:p>
@@ -2092,7 +2111,6 @@
                 <w:sz w:val="20"/>
                 <w:lang w:val="fr-FR"/>
               </w:rPr>
-              <w:lastRenderedPageBreak/>
               <w:t xml:space="preserve">Le recouvrement segmentaire doit être interprété comme un facteur de ciblage régional, non comme une condition nécessaire à tout effet viscéral. Une porte sans recouvrement S2–S4 peut encore agir par des relais intersegmentaires ou </w:t>
             </w:r>
             <w:proofErr w:type="spellStart"/>
@@ -2313,6 +2331,7 @@
         <w:rPr>
           <w:lang w:val="fr-FR"/>
         </w:rPr>
+        <w:lastRenderedPageBreak/>
         <w:t xml:space="preserve">Jusqu'ici, ce raisonnement conduisait à une prédiction simple : un gradient tibial &gt; sural/fibulaire &gt; saphène serait attendu si la proximité segmentaire gouvernait la réponse. </w:t>
       </w:r>
       <w:r>
@@ -2333,7 +2352,6 @@
         <w:rPr>
           <w:lang w:val="fr-FR"/>
         </w:rPr>
-        <w:lastRenderedPageBreak/>
         <w:t xml:space="preserve">Chez le rat anesthésié, la stimulation du nerf saphène inhibe le réflexe vésical, avec un effet dépendant de la fréquence [17]. Le résultat est retrouvé chez le chat, où la stimulation saphène modifie la capacité vésicale selon les paramètres appliqués [19]. Une étude mécanistique a par ailleurs montré que la section du nerf hypogastrique ne supprime pas cet effet inhibiteur, ce qui indique que cette voie sympathique périphérique ne suffit pas à l'expliquer [18]. Côté humain, une étude pilote de faisabilité a porté sur la stimulation percutanée du saphène chez des patientes présentant une hyperactivité vésicale : dix-huit incluses, seize ayant terminé, quatorze satisfaisant au critère composite défini par les auteurs [24]. Il s'agit d'une petite série non contrôlée, sans groupe </w:t>
       </w:r>
       <w:proofErr w:type="spellStart"/>
@@ -2650,14 +2668,8 @@
         <w:rPr>
           <w:lang w:val="fr-FR"/>
         </w:rPr>
-        <w:t xml:space="preserve">Des travaux expérimentaux sur la fonction vésicale montrent que des afférences tibiales et pudendales agissent à travers des mécanismes interneuronaux spinaux et modifient les réflexes de la vessie [11,15]. Une entrée somatique n'a donc pas besoin d'un trajet direct vers le viscère pour influencer un </w:t>
-      </w:r>
-      <w:r>
-        <w:rPr>
-          <w:lang w:val="fr-FR"/>
-        </w:rPr>
         <w:lastRenderedPageBreak/>
-        <w:t>circuit autonome : elle peut modifier l'excitabilité du réseau dans lequel l'information viscérale est traitée.</w:t>
+        <w:t>Des travaux expérimentaux sur la fonction vésicale montrent que des afférences tibiales et pudendales agissent à travers des mécanismes interneuronaux spinaux et modifient les réflexes de la vessie [11,15]. Une entrée somatique n'a donc pas besoin d'un trajet direct vers le viscère pour influencer un circuit autonome : elle peut modifier l'excitabilité du réseau dans lequel l'information viscérale est traitée.</w:t>
       </w:r>
     </w:p>
     <w:p>
@@ -2975,27 +2987,27 @@
         <w:rPr>
           <w:lang w:val="fr-FR"/>
         </w:rPr>
-        <w:t>Le Pont 5 décrit des commandes descendantes vers des circuits autonomes spinaux. Le Pont 6 décrit une autre voie effectrice : une sortie parasympathique qui quitte le tronc cérébral par des nerfs crâniens, sans passer par la moelle. Les deux voies partagent leur montée et leur intégration centrale, mais divergent au moment de la sortie.</w:t>
-      </w:r>
-    </w:p>
-    <w:p>
-      <w:pPr>
-        <w:rPr>
-          <w:lang w:val="fr-FR"/>
-        </w:rPr>
-      </w:pPr>
-      <w:r>
-        <w:rPr>
-          <w:lang w:val="fr-FR"/>
-        </w:rPr>
-        <w:t xml:space="preserve">Ce sixième pont a une particularité : aucune proximité segmentaire n'y est invocable. Entre une afférence plantaire et un ganglion parasympathique céphalique, il n'existe ni racine commune ni voie </w:t>
+        <w:t xml:space="preserve">Le Pont 5 décrit des commandes descendantes vers des circuits autonomes spinaux. Le Pont 6 décrit une autre voie effectrice : une sortie parasympathique qui quitte le tronc cérébral par des nerfs </w:t>
       </w:r>
       <w:r>
         <w:rPr>
           <w:lang w:val="fr-FR"/>
         </w:rPr>
         <w:lastRenderedPageBreak/>
-        <w:t>périphérique partagée. Toute modulation observée y est donc nécessairement centrale — ce qui en fait, malgré la minceur des données, le test le plus propre du modèle de réseau.</w:t>
+        <w:t>crâniens, sans passer par la moelle. Les deux voies partagent leur montée et leur intégration centrale, mais divergent au moment de la sortie.</w:t>
+      </w:r>
+    </w:p>
+    <w:p>
+      <w:pPr>
+        <w:rPr>
+          <w:lang w:val="fr-FR"/>
+        </w:rPr>
+      </w:pPr>
+      <w:r>
+        <w:rPr>
+          <w:lang w:val="fr-FR"/>
+        </w:rPr>
+        <w:t>Ce sixième pont a une particularité : aucune proximité segmentaire n'y est invocable. Entre une afférence plantaire et un ganglion parasympathique céphalique, il n'existe ni racine commune ni voie périphérique partagée. Toute modulation observée y est donc nécessairement centrale — ce qui en fait, malgré la minceur des données, le test le plus propre du modèle de réseau.</w:t>
       </w:r>
     </w:p>
     <w:p>
@@ -3152,7 +3164,15 @@
       </w:r>
       <w:proofErr w:type="spellEnd"/>
       <w:r>
-        <w:t xml:space="preserve"> même catégorie crée une ambiguïté.</w:t>
+        <w:t xml:space="preserve"> </w:t>
+      </w:r>
+      <w:proofErr w:type="spellStart"/>
+      <w:r>
+        <w:t>même</w:t>
+      </w:r>
+      <w:proofErr w:type="spellEnd"/>
+      <w:r>
+        <w:t xml:space="preserve"> catégorie crée une ambiguïté.</w:t>
       </w:r>
     </w:p>
     <w:tbl>
@@ -3320,6 +3340,7 @@
         <w:rPr>
           <w:lang w:val="fr-FR"/>
         </w:rPr>
+        <w:lastRenderedPageBreak/>
         <w:t xml:space="preserve">LIEN → </w:t>
       </w:r>
       <w:r>
@@ -3370,7 +3391,6 @@
           <w:sz w:val="27"/>
           <w:lang w:val="fr-FR"/>
         </w:rPr>
-        <w:lastRenderedPageBreak/>
         <w:t xml:space="preserve">4.  </w:t>
       </w:r>
       <w:r>
@@ -4044,15 +4064,7 @@
                 <w:sz w:val="20"/>
                 <w:lang w:val="fr-FR"/>
               </w:rPr>
-              <w:t xml:space="preserve">Tant que toutes les cibles documentées étaient aussi les plus proches de S2–S3, les deux axes variaient ensemble — et le modèle à deux axes se réduisait en pratique à une échelle unique de proximité </w:t>
-            </w:r>
-            <w:r>
-              <w:rPr>
-                <w:sz w:val="20"/>
-                <w:lang w:val="fr-FR"/>
-              </w:rPr>
-              <w:lastRenderedPageBreak/>
-              <w:t>segmentaire.</w:t>
+              <w:t>Tant que toutes les cibles documentées étaient aussi les plus proches de S2–S3, les deux axes variaient ensemble — et le modèle à deux axes se réduisait en pratique à une échelle unique de proximité segmentaire.</w:t>
             </w:r>
           </w:p>
           <w:p>
@@ -4472,7 +4484,21 @@
               <w:rPr>
                 <w:sz w:val="18"/>
               </w:rPr>
-              <w:t>, mais peu spécifique d'une région.</w:t>
+              <w:t xml:space="preserve">, mais peu </w:t>
+            </w:r>
+            <w:proofErr w:type="spellStart"/>
+            <w:r>
+              <w:rPr>
+                <w:sz w:val="18"/>
+              </w:rPr>
+              <w:t>spécifique</w:t>
+            </w:r>
+            <w:proofErr w:type="spellEnd"/>
+            <w:r>
+              <w:rPr>
+                <w:sz w:val="18"/>
+              </w:rPr>
+              <w:t xml:space="preserve"> d'une région.</w:t>
             </w:r>
           </w:p>
         </w:tc>
@@ -4827,7 +4853,15 @@
                 <w:sz w:val="18"/>
                 <w:lang w:val="fr-FR"/>
               </w:rPr>
-              <w:t>, essai randomisé contre traitement pharmacologique [21,22] ; données de maintien de la réponse [23].</w:t>
+              <w:t xml:space="preserve">, </w:t>
+            </w:r>
+            <w:r>
+              <w:rPr>
+                <w:sz w:val="18"/>
+                <w:lang w:val="fr-FR"/>
+              </w:rPr>
+              <w:lastRenderedPageBreak/>
+              <w:t>essai randomisé contre traitement pharmacologique [21,22] ; données de maintien de la réponse [23].</w:t>
             </w:r>
           </w:p>
         </w:tc>
@@ -4847,7 +4881,16 @@
                 <w:sz w:val="18"/>
                 <w:lang w:val="fr-FR"/>
               </w:rPr>
-              <w:t>Favorable. Référence clinique de la neuromodulation tibiale.</w:t>
+              <w:lastRenderedPageBreak/>
+              <w:t xml:space="preserve">Favorable. Référence clinique </w:t>
+            </w:r>
+            <w:r>
+              <w:rPr>
+                <w:sz w:val="18"/>
+                <w:lang w:val="fr-FR"/>
+              </w:rPr>
+              <w:lastRenderedPageBreak/>
+              <w:t>de la neuromodulation tibiale.</w:t>
             </w:r>
           </w:p>
         </w:tc>
@@ -4868,6 +4911,7 @@
               <w:rPr>
                 <w:sz w:val="18"/>
               </w:rPr>
+              <w:lastRenderedPageBreak/>
               <w:t xml:space="preserve">Incontinence </w:t>
             </w:r>
             <w:proofErr w:type="spellStart"/>
@@ -4937,15 +4981,7 @@
                 <w:sz w:val="18"/>
                 <w:lang w:val="fr-FR"/>
               </w:rPr>
-              <w:t xml:space="preserve">, essai </w:t>
-            </w:r>
-            <w:r>
-              <w:rPr>
-                <w:sz w:val="18"/>
-                <w:lang w:val="fr-FR"/>
-              </w:rPr>
-              <w:lastRenderedPageBreak/>
-              <w:t xml:space="preserve">randomisé contre </w:t>
+              <w:t xml:space="preserve">, essai randomisé contre </w:t>
             </w:r>
             <w:proofErr w:type="spellStart"/>
             <w:r>
@@ -4982,7 +5018,6 @@
                 <w:sz w:val="18"/>
                 <w:lang w:val="fr-FR"/>
               </w:rPr>
-              <w:lastRenderedPageBreak/>
               <w:t xml:space="preserve">Pas de supériorité démontrée sur le </w:t>
             </w:r>
             <w:proofErr w:type="spellStart"/>
@@ -5000,15 +5035,7 @@
                 <w:sz w:val="18"/>
                 <w:lang w:val="fr-FR"/>
               </w:rPr>
-              <w:t xml:space="preserve"> dans les deux </w:t>
-            </w:r>
-            <w:r>
-              <w:rPr>
-                <w:sz w:val="18"/>
-                <w:lang w:val="fr-FR"/>
-              </w:rPr>
-              <w:lastRenderedPageBreak/>
-              <w:t>essais.</w:t>
+              <w:t xml:space="preserve"> dans les deux essais.</w:t>
             </w:r>
           </w:p>
         </w:tc>
@@ -5029,7 +5056,6 @@
               <w:rPr>
                 <w:sz w:val="18"/>
               </w:rPr>
-              <w:lastRenderedPageBreak/>
               <w:t xml:space="preserve">Constipation, </w:t>
             </w:r>
             <w:proofErr w:type="spellStart"/>
@@ -5497,6 +5523,7 @@
           <w:sz w:val="23"/>
           <w:lang w:val="fr-FR"/>
         </w:rPr>
+        <w:lastRenderedPageBreak/>
         <w:t>6.3. Comparaison entre cibles viscérales : tester le gradient</w:t>
       </w:r>
     </w:p>
@@ -5510,14 +5537,7 @@
         <w:rPr>
           <w:lang w:val="fr-FR"/>
         </w:rPr>
-        <w:t xml:space="preserve">Le pelvis constitue le premier terrain de validation, parce qu'il combine la densité de ponts la plus forte et un modèle fonctionnel déjà largement étudié [8-16]. Le côlon distal et le rectum représentent une seconde cible logique [30-34]. Les cibles du quadrant 3 — duodénum, jéjunum, réponse pupillaire — </w:t>
-      </w:r>
-      <w:r>
-        <w:rPr>
-          <w:lang w:val="fr-FR"/>
-        </w:rPr>
-        <w:lastRenderedPageBreak/>
-        <w:t xml:space="preserve">permettent ensuite de mesurer directement la part des mécanismes intersegmentaires et </w:t>
+        <w:t xml:space="preserve">Le pelvis constitue le premier terrain de validation, parce qu'il combine la densité de ponts la plus forte et un modèle fonctionnel déjà largement étudié [8-16]. Le côlon distal et le rectum représentent une seconde cible logique [30-34]. Les cibles du quadrant 3 — duodénum, jéjunum, réponse pupillaire — permettent ensuite de mesurer directement la part des mécanismes intersegmentaires et </w:t>
       </w:r>
       <w:proofErr w:type="spellStart"/>
       <w:r>
@@ -6029,6 +6049,7 @@
         <w:rPr>
           <w:lang w:val="fr-FR"/>
         </w:rPr>
+        <w:lastRenderedPageBreak/>
         <w:t>La question spécifique à la R.O.P. devient alors : une pression manuelle reproductible sur un territoire anatomiquement défini produit-elle une activité afférente suffisante pour modifier un marqueur neurophysiologique, autonome ou viscéral ? Ce n'est qu'après cette étape qu'il devient pertinent de tester la spécificité de la zone.</w:t>
       </w:r>
     </w:p>
@@ -6044,7 +6065,6 @@
           <w:color w:val="287049"/>
           <w:sz w:val="23"/>
         </w:rPr>
-        <w:lastRenderedPageBreak/>
         <w:t>6.6. Variables à documenter</w:t>
       </w:r>
     </w:p>
@@ -6325,6 +6345,7 @@
         <w:rPr>
           <w:lang w:val="fr-FR"/>
         </w:rPr>
+        <w:lastRenderedPageBreak/>
         <w:t xml:space="preserve">La bibliographie retenue soutient particulièrement la plante du pied, l'anatomie du nerf tibial et de ses branches, la neuromodulation vésicale, les réseaux sacrés, les interactions vessie-intestin, les réflexes </w:t>
       </w:r>
       <w:proofErr w:type="spellStart"/>
@@ -6372,7 +6393,6 @@
           <w:sz w:val="27"/>
           <w:lang w:val="fr-FR"/>
         </w:rPr>
-        <w:lastRenderedPageBreak/>
         <w:t xml:space="preserve">8.  </w:t>
       </w:r>
       <w:r>
@@ -6596,6 +6616,7 @@
           <w:sz w:val="20"/>
           <w:lang w:val="fr-FR"/>
         </w:rPr>
+        <w:lastRenderedPageBreak/>
         <w:t xml:space="preserve">Afférences viscérales cheminant avec les voies splanchniques </w:t>
       </w:r>
       <w:proofErr w:type="spellStart"/>
@@ -6664,7 +6685,6 @@
           <w:sz w:val="20"/>
           <w:lang w:val="fr-FR"/>
         </w:rPr>
-        <w:lastRenderedPageBreak/>
         <w:t xml:space="preserve">Modulation viscérale — </w:t>
       </w:r>
       <w:r>
@@ -7255,6 +7275,7 @@
           <w:b/>
           <w:lang w:val="fr-FR"/>
         </w:rPr>
+        <w:lastRenderedPageBreak/>
         <w:t>B. Contrôle nerveux du bas appareil urinaire</w:t>
       </w:r>
     </w:p>
@@ -7325,7 +7346,6 @@
           <w:b/>
           <w:sz w:val="18"/>
         </w:rPr>
-        <w:lastRenderedPageBreak/>
         <w:t>11.</w:t>
       </w:r>
       <w:r>
@@ -7729,9 +7749,6 @@
       <w:pPr>
         <w:spacing w:after="80"/>
         <w:ind w:left="454" w:hanging="454"/>
-        <w:rPr>
-          <w:lang w:val="fr-FR"/>
-        </w:rPr>
       </w:pPr>
       <w:r>
         <w:rPr>
@@ -7749,71 +7766,20 @@
       <w:r>
         <w:rPr>
           <w:sz w:val="18"/>
-          <w:lang w:val="fr-FR"/>
-        </w:rPr>
-        <w:t xml:space="preserve">J </w:t>
-      </w:r>
-      <w:proofErr w:type="spellStart"/>
-      <w:r>
-        <w:rPr>
-          <w:sz w:val="18"/>
-          <w:lang w:val="fr-FR"/>
-        </w:rPr>
-        <w:t>Urol</w:t>
-      </w:r>
-      <w:proofErr w:type="spellEnd"/>
-      <w:r>
-        <w:rPr>
-          <w:sz w:val="18"/>
-          <w:lang w:val="fr-FR"/>
-        </w:rPr>
-        <w:t xml:space="preserve">. </w:t>
+        </w:rPr>
+        <w:t xml:space="preserve">J Urol. 2009;182(3):1055–1061. </w:t>
       </w:r>
       <w:proofErr w:type="gramStart"/>
       <w:r>
         <w:rPr>
           <w:sz w:val="18"/>
-          <w:lang w:val="fr-FR"/>
-        </w:rPr>
-        <w:t>2009;</w:t>
+        </w:rPr>
+        <w:t>doi:10.1016/j.juro</w:t>
       </w:r>
       <w:proofErr w:type="gramEnd"/>
       <w:r>
         <w:rPr>
           <w:sz w:val="18"/>
-          <w:lang w:val="fr-FR"/>
-        </w:rPr>
-        <w:t>182(3</w:t>
-      </w:r>
-      <w:proofErr w:type="gramStart"/>
-      <w:r>
-        <w:rPr>
-          <w:sz w:val="18"/>
-          <w:lang w:val="fr-FR"/>
-        </w:rPr>
-        <w:t>):</w:t>
-      </w:r>
-      <w:proofErr w:type="gramEnd"/>
-      <w:r>
-        <w:rPr>
-          <w:sz w:val="18"/>
-          <w:lang w:val="fr-FR"/>
-        </w:rPr>
-        <w:t xml:space="preserve">1055–1061. </w:t>
-      </w:r>
-      <w:proofErr w:type="gramStart"/>
-      <w:r>
-        <w:rPr>
-          <w:sz w:val="18"/>
-          <w:lang w:val="fr-FR"/>
-        </w:rPr>
-        <w:t>doi:10.1016/j.juro</w:t>
-      </w:r>
-      <w:proofErr w:type="gramEnd"/>
-      <w:r>
-        <w:rPr>
-          <w:sz w:val="18"/>
-          <w:lang w:val="fr-FR"/>
         </w:rPr>
         <w:t>.2009.05.045.</w:t>
       </w:r>
@@ -7890,6 +7856,7 @@
           <w:b/>
           <w:sz w:val="18"/>
         </w:rPr>
+        <w:lastRenderedPageBreak/>
         <w:t>25.</w:t>
       </w:r>
       <w:r>
@@ -7950,7 +7917,6 @@
           <w:b/>
           <w:sz w:val="18"/>
         </w:rPr>
-        <w:lastRenderedPageBreak/>
         <w:t>28.</w:t>
       </w:r>
       <w:r>
@@ -8077,9 +8043,6 @@
       <w:pPr>
         <w:spacing w:after="80"/>
         <w:ind w:left="454" w:hanging="454"/>
-        <w:rPr>
-          <w:lang w:val="fr-FR"/>
-        </w:rPr>
       </w:pPr>
       <w:r>
         <w:rPr>
@@ -8097,55 +8060,20 @@
       <w:r>
         <w:rPr>
           <w:sz w:val="18"/>
-          <w:lang w:val="fr-FR"/>
-        </w:rPr>
-        <w:t xml:space="preserve">Neuroscience. </w:t>
+        </w:rPr>
+        <w:t xml:space="preserve">Neuroscience. 2007;149(3):660–672. </w:t>
       </w:r>
       <w:proofErr w:type="gramStart"/>
       <w:r>
         <w:rPr>
           <w:sz w:val="18"/>
-          <w:lang w:val="fr-FR"/>
-        </w:rPr>
-        <w:t>2007;</w:t>
+        </w:rPr>
+        <w:t>doi:10.1016/j.neuroscience</w:t>
       </w:r>
       <w:proofErr w:type="gramEnd"/>
       <w:r>
         <w:rPr>
           <w:sz w:val="18"/>
-          <w:lang w:val="fr-FR"/>
-        </w:rPr>
-        <w:t>149(3</w:t>
-      </w:r>
-      <w:proofErr w:type="gramStart"/>
-      <w:r>
-        <w:rPr>
-          <w:sz w:val="18"/>
-          <w:lang w:val="fr-FR"/>
-        </w:rPr>
-        <w:t>):</w:t>
-      </w:r>
-      <w:proofErr w:type="gramEnd"/>
-      <w:r>
-        <w:rPr>
-          <w:sz w:val="18"/>
-          <w:lang w:val="fr-FR"/>
-        </w:rPr>
-        <w:t xml:space="preserve">660–672. </w:t>
-      </w:r>
-      <w:proofErr w:type="gramStart"/>
-      <w:r>
-        <w:rPr>
-          <w:sz w:val="18"/>
-          <w:lang w:val="fr-FR"/>
-        </w:rPr>
-        <w:t>doi:10.1016/j.neuroscience</w:t>
-      </w:r>
-      <w:proofErr w:type="gramEnd"/>
-      <w:r>
-        <w:rPr>
-          <w:sz w:val="18"/>
-          <w:lang w:val="fr-FR"/>
         </w:rPr>
         <w:t>.2007.07.053.</w:t>
       </w:r>
@@ -8368,6 +8296,7 @@
           <w:b/>
           <w:sz w:val="18"/>
         </w:rPr>
+        <w:lastRenderedPageBreak/>
         <w:t>42.</w:t>
       </w:r>
       <w:r>
@@ -8419,7 +8348,6 @@
           <w:b/>
           <w:sz w:val="18"/>
         </w:rPr>
-        <w:lastRenderedPageBreak/>
         <w:t>44.</w:t>
       </w:r>
       <w:r>

</xml_diff>

<commit_message>
Update neuro-anatomical foundations source
</commit_message>
<xml_diff>
--- a/public/assets/Fondements Neuro-Anatomiques/ROP_v3C_Hub_Fondements_neuro-anatomiques.docx
+++ b/public/assets/Fondements Neuro-Anatomiques/ROP_v3C_Hub_Fondements_neuro-anatomiques.docx
@@ -280,39 +280,6 @@
           <w:lang w:val="fr-FR"/>
         </w:rPr>
       </w:pPr>
-      <w:r>
-        <w:rPr>
-          <w:lang w:val="fr-FR"/>
-        </w:rPr>
-        <w:t xml:space="preserve">Cette version intègre trois éléments qui modifient la lecture. Les données de stimulation du nerf saphène </w:t>
-      </w:r>
-      <w:r>
-        <w:rPr>
-          <w:b/>
-          <w:lang w:val="fr-FR"/>
-        </w:rPr>
-        <w:t>dissocient</w:t>
-      </w:r>
-      <w:r>
-        <w:rPr>
-          <w:lang w:val="fr-FR"/>
-        </w:rPr>
-        <w:t xml:space="preserve"> les deux questions au lieu de les superposer. Les réflexes </w:t>
-      </w:r>
-      <w:proofErr w:type="spellStart"/>
-      <w:r>
-        <w:rPr>
-          <w:lang w:val="fr-FR"/>
-        </w:rPr>
-        <w:t>somato</w:t>
-      </w:r>
-      <w:proofErr w:type="spellEnd"/>
-      <w:r>
-        <w:rPr>
-          <w:lang w:val="fr-FR"/>
-        </w:rPr>
-        <w:t>-viscéraux digestifs et céphaliques montrent qu'une entrée du membre inférieur peut modifier une fonction très éloignée de tout recouvrement segmentaire. Et les essais cliniques négatifs rappellent qu'un pont mécanistique ne prédit pas un effet thérapeutique.</w:t>
-      </w:r>
     </w:p>
     <w:tbl>
       <w:tblPr>
@@ -441,6 +408,7 @@
                 <w:sz w:val="20"/>
                 <w:lang w:val="fr-FR"/>
               </w:rPr>
+              <w:lastRenderedPageBreak/>
               <w:t>tronc nerveux</w:t>
             </w:r>
             <w:r>
@@ -533,23 +501,7 @@
           <w:b/>
           <w:sz w:val="27"/>
         </w:rPr>
-        <w:t xml:space="preserve">Lecture </w:t>
-      </w:r>
-      <w:proofErr w:type="gramStart"/>
-      <w:r>
-        <w:rPr>
-          <w:b/>
-          <w:sz w:val="27"/>
-        </w:rPr>
-        <w:t>rapide :</w:t>
-      </w:r>
-      <w:proofErr w:type="gramEnd"/>
-      <w:r>
-        <w:rPr>
-          <w:b/>
-          <w:sz w:val="27"/>
-        </w:rPr>
-        <w:t xml:space="preserve"> les conclusions essentielles</w:t>
+        <w:t>Lecture rapide : les conclusions essentielles</w:t>
       </w:r>
     </w:p>
     <w:p>
@@ -813,14 +765,20 @@
           <w:b/>
           <w:lang w:val="fr-FR"/>
         </w:rPr>
+        <w:t>Une entrée du membre inférieur peut modifier une sortie autonome crânienne.</w:t>
+      </w:r>
+      <w:r>
+        <w:rPr>
+          <w:lang w:val="fr-FR"/>
+        </w:rPr>
+        <w:t xml:space="preserve"> Chez le rat, une stimulation de la patte postérieure recrutant les afférences tibiales et saphènes modifie le diamètre pupillaire ; la réponse disparaît après section du nerf oculomoteur mais persiste après </w:t>
+      </w:r>
+      <w:r>
+        <w:rPr>
+          <w:lang w:val="fr-FR"/>
+        </w:rPr>
         <w:lastRenderedPageBreak/>
-        <w:t>Une entrée du membre inférieur peut modifier une sortie autonome crânienne.</w:t>
-      </w:r>
-      <w:r>
-        <w:rPr>
-          <w:lang w:val="fr-FR"/>
-        </w:rPr>
-        <w:t xml:space="preserve"> Chez le rat, une stimulation de la patte postérieure recrutant les afférences tibiales et saphènes modifie le diamètre pupillaire ; la réponse disparaît après section du nerf oculomoteur mais persiste après section des troncs sympathiques cervicaux [43]. C'est le seul trajet documenté où la proximité segmentaire est nulle par construction.</w:t>
+        <w:t>section des troncs sympathiques cervicaux [43]. C'est le seul trajet documenté où la proximité segmentaire est nulle par construction.</w:t>
       </w:r>
     </w:p>
     <w:p>
@@ -1507,7 +1465,6 @@
         <w:rPr>
           <w:lang w:val="fr-FR"/>
         </w:rPr>
-        <w:lastRenderedPageBreak/>
         <w:t>Ces quatre portes peuvent toutes générer une entrée somatique ascendante. La question scientifique n'est donc pas de savoir si une seule zone « communique avec le cerveau », mais si le nerf d'entrée, la branche périphérique et la population afférente recrutée modifient la nature, l'intensité ou la spécificité de la réponse centrale et viscérale.</w:t>
       </w:r>
     </w:p>
@@ -1527,6 +1484,7 @@
           <w:sz w:val="23"/>
           <w:lang w:val="fr-FR"/>
         </w:rPr>
+        <w:lastRenderedPageBreak/>
         <w:t>1.3. Du pied vers le système nerveux central</w:t>
       </w:r>
     </w:p>
@@ -1588,7 +1546,6 @@
         <w:t>FIGURE — existante : pont-</w:t>
       </w:r>
       <w:proofErr w:type="spellStart"/>
-      <w:proofErr w:type="gramStart"/>
       <w:r>
         <w:rPr>
           <w:i/>
@@ -1599,7 +1556,6 @@
         <w:t>schema.webp</w:t>
       </w:r>
       <w:proofErr w:type="spellEnd"/>
-      <w:proofErr w:type="gramEnd"/>
       <w:r>
         <w:rPr>
           <w:i/>
@@ -1708,7 +1664,6 @@
         <w:t>FIGURE — existante : versant-</w:t>
       </w:r>
       <w:proofErr w:type="spellStart"/>
-      <w:proofErr w:type="gramStart"/>
       <w:r>
         <w:rPr>
           <w:i/>
@@ -1719,7 +1674,6 @@
         <w:t>visceral.webp</w:t>
       </w:r>
       <w:proofErr w:type="spellEnd"/>
-      <w:proofErr w:type="gramEnd"/>
       <w:r>
         <w:rPr>
           <w:i/>
@@ -1746,7 +1700,6 @@
           <w:sz w:val="27"/>
           <w:lang w:val="fr-FR"/>
         </w:rPr>
-        <w:lastRenderedPageBreak/>
         <w:t xml:space="preserve">3.  </w:t>
       </w:r>
       <w:r>
@@ -1781,6 +1734,7 @@
         <w:rPr>
           <w:lang w:val="fr-FR"/>
         </w:rPr>
+        <w:lastRenderedPageBreak/>
         <w:t xml:space="preserve">Ces six ponts ne relèvent pas du même type d'argument, et les confondre a longtemps brouillé la discussion. Les </w:t>
       </w:r>
       <w:r>
@@ -2011,14 +1965,7 @@
         <w:rPr>
           <w:lang w:val="fr-FR"/>
         </w:rPr>
-        <w:t xml:space="preserve">Le Pont 1 doit donc être formulé avec précision : une stimulation d'un territoire tibial peut introduire une activité afférente dans un ensemble lombo-sacré contenant S2–S3 et communiquant avec les circuits pelviens. Elle ne sélectionne pas automatiquement S2 ou S3, ne rejoint pas directement un organe et </w:t>
-      </w:r>
-      <w:r>
-        <w:rPr>
-          <w:lang w:val="fr-FR"/>
-        </w:rPr>
-        <w:lastRenderedPageBreak/>
-        <w:t>ne garantit pas une réponse viscérale. Elle apporte cependant un argument de proximité segmentaire plus dense que celui de certaines portes plus lombaires.</w:t>
+        <w:t>Le Pont 1 doit donc être formulé avec précision : une stimulation d'un territoire tibial peut introduire une activité afférente dans un ensemble lombo-sacré contenant S2–S3 et communiquant avec les circuits pelviens. Elle ne sélectionne pas automatiquement S2 ou S3, ne rejoint pas directement un organe et ne garantit pas une réponse viscérale. Elle apporte cependant un argument de proximité segmentaire plus dense que celui de certaines portes plus lombaires.</w:t>
       </w:r>
     </w:p>
     <w:p>
@@ -2036,27 +1983,7 @@
           <w:sz w:val="18"/>
           <w:lang w:val="fr-FR"/>
         </w:rPr>
-        <w:t>FIGURE — existante : pont-1-</w:t>
-      </w:r>
-      <w:proofErr w:type="gramStart"/>
-      <w:r>
-        <w:rPr>
-          <w:i/>
-          <w:color w:val="5A5A5A"/>
-          <w:sz w:val="18"/>
-          <w:lang w:val="fr-FR"/>
-        </w:rPr>
-        <w:t>tibial.webp</w:t>
-      </w:r>
-      <w:proofErr w:type="gramEnd"/>
-      <w:r>
-        <w:rPr>
-          <w:i/>
-          <w:color w:val="5A5A5A"/>
-          <w:sz w:val="18"/>
-          <w:lang w:val="fr-FR"/>
-        </w:rPr>
-        <w:t>. Le nerf tibial, une porte d'entrée lombo-sacrée.</w:t>
+        <w:t>FIGURE — existante : pont-1-tibial.webp. Le nerf tibial, une porte d'entrée lombo-sacrée.</w:t>
       </w:r>
     </w:p>
     <w:tbl>
@@ -2111,6 +2038,7 @@
                 <w:sz w:val="20"/>
                 <w:lang w:val="fr-FR"/>
               </w:rPr>
+              <w:lastRenderedPageBreak/>
               <w:t xml:space="preserve">Le recouvrement segmentaire doit être interprété comme un facteur de ciblage régional, non comme une condition nécessaire à tout effet viscéral. Une porte sans recouvrement S2–S4 peut encore agir par des relais intersegmentaires ou </w:t>
             </w:r>
             <w:proofErr w:type="spellStart"/>
@@ -2266,27 +2194,7 @@
           <w:sz w:val="18"/>
           <w:lang w:val="fr-FR"/>
         </w:rPr>
-        <w:t>FIGURE — existante : pont-2-</w:t>
-      </w:r>
-      <w:proofErr w:type="gramStart"/>
-      <w:r>
-        <w:rPr>
-          <w:i/>
-          <w:color w:val="5A5A5A"/>
-          <w:sz w:val="18"/>
-          <w:lang w:val="fr-FR"/>
-        </w:rPr>
-        <w:t>plantaires.webp</w:t>
-      </w:r>
-      <w:proofErr w:type="gramEnd"/>
-      <w:r>
-        <w:rPr>
-          <w:i/>
-          <w:color w:val="5A5A5A"/>
-          <w:sz w:val="18"/>
-          <w:lang w:val="fr-FR"/>
-        </w:rPr>
-        <w:t>. De la zone podale au nerf tibial : talon, arche et avant-pied au sein d'un même tronc nerveux.</w:t>
+        <w:t>FIGURE — existante : pont-2-plantaires.webp. De la zone podale au nerf tibial : talon, arche et avant-pied au sein d'un même tronc nerveux.</w:t>
       </w:r>
     </w:p>
     <w:p>
@@ -2603,9 +2511,89 @@
           <w:sz w:val="18"/>
           <w:lang w:val="fr-FR"/>
         </w:rPr>
-        <w:t>FIGURE — existante : pont-3-autres-</w:t>
-      </w:r>
-      <w:proofErr w:type="gramStart"/>
+        <w:t>FIGURE — existante : pont-3-autres-nerfs.webp. À mettre à jour : la vignette saphène doit désormais porter la mention « module la vessie sans recouvrement sacré » plutôt qu'une position de simple contrôle.</w:t>
+      </w:r>
+    </w:p>
+    <w:p>
+      <w:pPr>
+        <w:keepNext/>
+        <w:spacing w:before="260" w:after="100"/>
+        <w:jc w:val="left"/>
+        <w:rPr>
+          <w:lang w:val="fr-FR"/>
+        </w:rPr>
+      </w:pPr>
+      <w:r>
+        <w:rPr>
+          <w:b/>
+          <w:color w:val="287049"/>
+          <w:sz w:val="23"/>
+          <w:lang w:val="fr-FR"/>
+        </w:rPr>
+        <w:t>Pont 4 — Les réseaux lombo-sacrés : un carrefour d'intégration spinale</w:t>
+      </w:r>
+    </w:p>
+    <w:p>
+      <w:pPr>
+        <w:rPr>
+          <w:lang w:val="fr-FR"/>
+        </w:rPr>
+      </w:pPr>
+      <w:r>
+        <w:rPr>
+          <w:lang w:val="fr-FR"/>
+        </w:rPr>
+        <w:t>Les afférences qui pénètrent dans la moelle lombo-sacrée ne restent pas enfermées dans un segment isolé. Elles se distribuent à des interneurones excitateurs et inhibiteurs, à des neurones de projection et à des circuits reliant plusieurs niveaux. Dans les circuits pelviens, ces réseaux reçoivent des informations viscérales, périnéales et somatiques et sont simultanément soumis aux commandes descendantes du cerveau [9-11].</w:t>
+      </w:r>
+    </w:p>
+    <w:p>
+      <w:pPr>
+        <w:rPr>
+          <w:lang w:val="fr-FR"/>
+        </w:rPr>
+      </w:pPr>
+      <w:r>
+        <w:rPr>
+          <w:lang w:val="fr-FR"/>
+        </w:rPr>
+        <w:lastRenderedPageBreak/>
+        <w:t>Des travaux expérimentaux sur la fonction vésicale montrent que des afférences tibiales et pudendales agissent à travers des mécanismes interneuronaux spinaux et modifient les réflexes de la vessie [11,15]. Une entrée somatique n'a donc pas besoin d'un trajet direct vers le viscère pour influencer un circuit autonome : elle peut modifier l'excitabilité du réseau dans lequel l'information viscérale est traitée.</w:t>
+      </w:r>
+    </w:p>
+    <w:p>
+      <w:pPr>
+        <w:rPr>
+          <w:lang w:val="fr-FR"/>
+        </w:rPr>
+      </w:pPr>
+      <w:r>
+        <w:rPr>
+          <w:lang w:val="fr-FR"/>
+        </w:rPr>
+        <w:t>La réponse dépend de l'état du système. Fréquence, intensité, durée de stimulation, fibres recrutées et état fonctionnel du viscère peuvent modifier le sens de la réponse. Dans les modèles vésicaux, le degré de remplissage est une variable importante [8-11,14]. Une même porte périphérique peut donc être facilitatrice, inhibitrice ou sans effet selon les conditions.</w:t>
+      </w:r>
+    </w:p>
+    <w:p>
+      <w:pPr>
+        <w:rPr>
+          <w:lang w:val="fr-FR"/>
+        </w:rPr>
+      </w:pPr>
+      <w:r>
+        <w:rPr>
+          <w:lang w:val="fr-FR"/>
+        </w:rPr>
+        <w:t>Le petit bassin forme un réseau intégré plutôt qu'une juxtaposition d'organes indépendants. Les interactions entre vessie, côlon distal et rectum sont documentées à plusieurs niveaux, depuis certaines afférences primaires jusqu'aux réseaux spinaux et aux phénomènes de sensibilisation croisée [31-33]. Ces données justifient de parler d'abord de ciblage régional pelvien avant d'affirmer un ciblage d'organe isolé.</w:t>
+      </w:r>
+    </w:p>
+    <w:p>
+      <w:pPr>
+        <w:spacing w:after="200"/>
+        <w:jc w:val="left"/>
+        <w:rPr>
+          <w:lang w:val="fr-FR"/>
+        </w:rPr>
+      </w:pPr>
       <w:r>
         <w:rPr>
           <w:i/>
@@ -2613,9 +2601,9 @@
           <w:sz w:val="18"/>
           <w:lang w:val="fr-FR"/>
         </w:rPr>
-        <w:t>nerfs.webp</w:t>
-      </w:r>
-      <w:proofErr w:type="gramEnd"/>
+        <w:t xml:space="preserve">FIGURE — existantes : pont-4-lombosacre.webp et </w:t>
+      </w:r>
+      <w:proofErr w:type="spellStart"/>
       <w:r>
         <w:rPr>
           <w:i/>
@@ -2623,7 +2611,17 @@
           <w:sz w:val="18"/>
           <w:lang w:val="fr-FR"/>
         </w:rPr>
-        <w:t>. À mettre à jour : la vignette saphène doit désormais porter la mention « module la vessie sans recouvrement sacré » plutôt qu'une position de simple contrôle.</w:t>
+        <w:t>reseaux-pelviens.webp</w:t>
+      </w:r>
+      <w:proofErr w:type="spellEnd"/>
+      <w:r>
+        <w:rPr>
+          <w:i/>
+          <w:color w:val="5A5A5A"/>
+          <w:sz w:val="18"/>
+          <w:lang w:val="fr-FR"/>
+        </w:rPr>
+        <w:t>.</w:t>
       </w:r>
     </w:p>
     <w:p>
@@ -2642,60 +2640,121 @@
           <w:sz w:val="23"/>
           <w:lang w:val="fr-FR"/>
         </w:rPr>
-        <w:t>Pont 4 — Les réseaux lombo-sacrés : un carrefour d'intégration spinale</w:t>
-      </w:r>
-    </w:p>
-    <w:p>
-      <w:pPr>
-        <w:rPr>
-          <w:lang w:val="fr-FR"/>
-        </w:rPr>
-      </w:pPr>
-      <w:r>
-        <w:rPr>
-          <w:lang w:val="fr-FR"/>
-        </w:rPr>
-        <w:t>Les afférences qui pénètrent dans la moelle lombo-sacrée ne restent pas enfermées dans un segment isolé. Elles se distribuent à des interneurones excitateurs et inhibiteurs, à des neurones de projection et à des circuits reliant plusieurs niveaux. Dans les circuits pelviens, ces réseaux reçoivent des informations viscérales, périnéales et somatiques et sont simultanément soumis aux commandes descendantes du cerveau [9-11].</w:t>
-      </w:r>
-    </w:p>
-    <w:p>
-      <w:pPr>
-        <w:rPr>
-          <w:lang w:val="fr-FR"/>
-        </w:rPr>
-      </w:pPr>
-      <w:r>
-        <w:rPr>
-          <w:lang w:val="fr-FR"/>
-        </w:rPr>
-        <w:lastRenderedPageBreak/>
-        <w:t>Des travaux expérimentaux sur la fonction vésicale montrent que des afférences tibiales et pudendales agissent à travers des mécanismes interneuronaux spinaux et modifient les réflexes de la vessie [11,15]. Une entrée somatique n'a donc pas besoin d'un trajet direct vers le viscère pour influencer un circuit autonome : elle peut modifier l'excitabilité du réseau dans lequel l'information viscérale est traitée.</w:t>
-      </w:r>
-    </w:p>
-    <w:p>
-      <w:pPr>
-        <w:rPr>
-          <w:lang w:val="fr-FR"/>
-        </w:rPr>
-      </w:pPr>
-      <w:r>
-        <w:rPr>
-          <w:lang w:val="fr-FR"/>
-        </w:rPr>
-        <w:t>La réponse dépend de l'état du système. Fréquence, intensité, durée de stimulation, fibres recrutées et état fonctionnel du viscère peuvent modifier le sens de la réponse. Dans les modèles vésicaux, le degré de remplissage est une variable importante [8-11,14]. Une même porte périphérique peut donc être facilitatrice, inhibitrice ou sans effet selon les conditions.</w:t>
-      </w:r>
-    </w:p>
-    <w:p>
-      <w:pPr>
-        <w:rPr>
-          <w:lang w:val="fr-FR"/>
-        </w:rPr>
-      </w:pPr>
-      <w:r>
-        <w:rPr>
-          <w:lang w:val="fr-FR"/>
-        </w:rPr>
-        <w:t>Le petit bassin forme un réseau intégré plutôt qu'une juxtaposition d'organes indépendants. Les interactions entre vessie, côlon distal et rectum sont documentées à plusieurs niveaux, depuis certaines afférences primaires jusqu'aux réseaux spinaux et aux phénomènes de sensibilisation croisée [31-33]. Ces données justifient de parler d'abord de ciblage régional pelvien avant d'affirmer un ciblage d'organe isolé.</w:t>
+        <w:t xml:space="preserve">Pont 5 — Les voies </w:t>
+      </w:r>
+      <w:proofErr w:type="spellStart"/>
+      <w:r>
+        <w:rPr>
+          <w:b/>
+          <w:color w:val="287049"/>
+          <w:sz w:val="23"/>
+          <w:lang w:val="fr-FR"/>
+        </w:rPr>
+        <w:t>supraspinales</w:t>
+      </w:r>
+      <w:proofErr w:type="spellEnd"/>
+      <w:r>
+        <w:rPr>
+          <w:b/>
+          <w:color w:val="287049"/>
+          <w:sz w:val="23"/>
+          <w:lang w:val="fr-FR"/>
+        </w:rPr>
+        <w:t xml:space="preserve"> : commandes descendantes et fonctions à distance</w:t>
+      </w:r>
+    </w:p>
+    <w:p>
+      <w:pPr>
+        <w:rPr>
+          <w:lang w:val="fr-FR"/>
+        </w:rPr>
+      </w:pPr>
+      <w:r>
+        <w:rPr>
+          <w:lang w:val="fr-FR"/>
+        </w:rPr>
+        <w:t xml:space="preserve">Une entrée somatique issue du pied peut remonter vers les centres supérieurs, participer à l'activité de réseaux cérébraux, puis modifier des commandes descendantes vers la moelle et les circuits autonomes. La littérature expérimentale sur les réflexes </w:t>
+      </w:r>
+      <w:proofErr w:type="spellStart"/>
+      <w:r>
+        <w:rPr>
+          <w:lang w:val="fr-FR"/>
+        </w:rPr>
+        <w:t>somato</w:t>
+      </w:r>
+      <w:proofErr w:type="spellEnd"/>
+      <w:r>
+        <w:rPr>
+          <w:lang w:val="fr-FR"/>
+        </w:rPr>
+        <w:t xml:space="preserve">-autonomes montre de façon générale que l'entrée somatosensorielle peut influencer des fonctions autonomes par des mécanismes spinaux et </w:t>
+      </w:r>
+      <w:proofErr w:type="spellStart"/>
+      <w:r>
+        <w:rPr>
+          <w:lang w:val="fr-FR"/>
+        </w:rPr>
+        <w:t>supraspinaux</w:t>
+      </w:r>
+      <w:proofErr w:type="spellEnd"/>
+      <w:r>
+        <w:rPr>
+          <w:lang w:val="fr-FR"/>
+        </w:rPr>
+        <w:t xml:space="preserve"> [48].</w:t>
+      </w:r>
+    </w:p>
+    <w:p>
+      <w:pPr>
+        <w:rPr>
+          <w:lang w:val="fr-FR"/>
+        </w:rPr>
+      </w:pPr>
+      <w:r>
+        <w:rPr>
+          <w:lang w:val="fr-FR"/>
+        </w:rPr>
+        <w:t>Pour la vessie, ce contrôle central est particulièrement bien décrit. Les informations viscérales et somatiques sont intégrées à plusieurs niveaux impliquant la substance grise périaqueducale, des centres pontiques, l'insula, le cortex cingulaire et les régions préfrontales ; ces réseaux participent à la perception de l'état viscéral, à l'attention, au contexte, à la décision et à la coordination des réponses autonomes et sphinctériennes [8,12,13].</w:t>
+      </w:r>
+    </w:p>
+    <w:p>
+      <w:pPr>
+        <w:rPr>
+          <w:lang w:val="fr-FR"/>
+        </w:rPr>
+      </w:pPr>
+      <w:r>
+        <w:rPr>
+          <w:lang w:val="fr-FR"/>
+        </w:rPr>
+        <w:t>Le terme « cerveau limbique » doit être utilisé avec prudence : il est préférable de nommer les structures ou les réseaux concernés plutôt que de suggérer l'existence d'un centre limbique unique de la R.O.P. Les réponses cérébrales observées lors de stimulations transcutanées tibiales et fibulaires ne sont d'ailleurs pas identiques [16] : plusieurs portes périphériques peuvent atteindre des réseaux centraux partiellement communs tout en conservant des profils différents.</w:t>
+      </w:r>
+    </w:p>
+    <w:p>
+      <w:pPr>
+        <w:rPr>
+          <w:lang w:val="fr-FR"/>
+        </w:rPr>
+      </w:pPr>
+      <w:r>
+        <w:rPr>
+          <w:lang w:val="fr-FR"/>
+        </w:rPr>
+        <w:t xml:space="preserve">Le principal enseignement du Pont 5 est méthodologique : l'absence de recouvrement radiculaire direct ne suffit pas à exclure un effet viscéral. En revanche, plus l'hypothèse dépend exclusivement de relais </w:t>
+      </w:r>
+      <w:proofErr w:type="spellStart"/>
+      <w:r>
+        <w:rPr>
+          <w:lang w:val="fr-FR"/>
+        </w:rPr>
+        <w:t>supraspinaux</w:t>
+      </w:r>
+      <w:proofErr w:type="spellEnd"/>
+      <w:r>
+        <w:rPr>
+          <w:lang w:val="fr-FR"/>
+        </w:rPr>
+        <w:t xml:space="preserve"> généraux, moins elle permet d'affirmer une spécificité régionale ou une correspondance point-organe.</w:t>
       </w:r>
     </w:p>
     <w:p>
@@ -2713,249 +2772,7 @@
           <w:sz w:val="18"/>
           <w:lang w:val="fr-FR"/>
         </w:rPr>
-        <w:t>FIGURE — existantes : pont-4-</w:t>
-      </w:r>
-      <w:proofErr w:type="gramStart"/>
-      <w:r>
-        <w:rPr>
-          <w:i/>
-          <w:color w:val="5A5A5A"/>
-          <w:sz w:val="18"/>
-          <w:lang w:val="fr-FR"/>
-        </w:rPr>
-        <w:t>lombosacre.webp</w:t>
-      </w:r>
-      <w:proofErr w:type="gramEnd"/>
-      <w:r>
-        <w:rPr>
-          <w:i/>
-          <w:color w:val="5A5A5A"/>
-          <w:sz w:val="18"/>
-          <w:lang w:val="fr-FR"/>
-        </w:rPr>
-        <w:t xml:space="preserve"> et </w:t>
-      </w:r>
-      <w:proofErr w:type="spellStart"/>
-      <w:r>
-        <w:rPr>
-          <w:i/>
-          <w:color w:val="5A5A5A"/>
-          <w:sz w:val="18"/>
-          <w:lang w:val="fr-FR"/>
-        </w:rPr>
-        <w:t>reseaux-</w:t>
-      </w:r>
-      <w:proofErr w:type="gramStart"/>
-      <w:r>
-        <w:rPr>
-          <w:i/>
-          <w:color w:val="5A5A5A"/>
-          <w:sz w:val="18"/>
-          <w:lang w:val="fr-FR"/>
-        </w:rPr>
-        <w:t>pelviens.webp</w:t>
-      </w:r>
-      <w:proofErr w:type="spellEnd"/>
-      <w:proofErr w:type="gramEnd"/>
-      <w:r>
-        <w:rPr>
-          <w:i/>
-          <w:color w:val="5A5A5A"/>
-          <w:sz w:val="18"/>
-          <w:lang w:val="fr-FR"/>
-        </w:rPr>
-        <w:t>.</w:t>
-      </w:r>
-    </w:p>
-    <w:p>
-      <w:pPr>
-        <w:keepNext/>
-        <w:spacing w:before="260" w:after="100"/>
-        <w:jc w:val="left"/>
-        <w:rPr>
-          <w:lang w:val="fr-FR"/>
-        </w:rPr>
-      </w:pPr>
-      <w:r>
-        <w:rPr>
-          <w:b/>
-          <w:color w:val="287049"/>
-          <w:sz w:val="23"/>
-          <w:lang w:val="fr-FR"/>
-        </w:rPr>
-        <w:t xml:space="preserve">Pont 5 — Les voies </w:t>
-      </w:r>
-      <w:proofErr w:type="spellStart"/>
-      <w:r>
-        <w:rPr>
-          <w:b/>
-          <w:color w:val="287049"/>
-          <w:sz w:val="23"/>
-          <w:lang w:val="fr-FR"/>
-        </w:rPr>
-        <w:t>supraspinales</w:t>
-      </w:r>
-      <w:proofErr w:type="spellEnd"/>
-      <w:r>
-        <w:rPr>
-          <w:b/>
-          <w:color w:val="287049"/>
-          <w:sz w:val="23"/>
-          <w:lang w:val="fr-FR"/>
-        </w:rPr>
-        <w:t xml:space="preserve"> : commandes descendantes et fonctions à distance</w:t>
-      </w:r>
-    </w:p>
-    <w:p>
-      <w:pPr>
-        <w:rPr>
-          <w:lang w:val="fr-FR"/>
-        </w:rPr>
-      </w:pPr>
-      <w:r>
-        <w:rPr>
-          <w:lang w:val="fr-FR"/>
-        </w:rPr>
-        <w:t xml:space="preserve">Une entrée somatique issue du pied peut remonter vers les centres supérieurs, participer à l'activité de réseaux cérébraux, puis modifier des commandes descendantes vers la moelle et les circuits autonomes. La littérature expérimentale sur les réflexes </w:t>
-      </w:r>
-      <w:proofErr w:type="spellStart"/>
-      <w:r>
-        <w:rPr>
-          <w:lang w:val="fr-FR"/>
-        </w:rPr>
-        <w:t>somato</w:t>
-      </w:r>
-      <w:proofErr w:type="spellEnd"/>
-      <w:r>
-        <w:rPr>
-          <w:lang w:val="fr-FR"/>
-        </w:rPr>
-        <w:t xml:space="preserve">-autonomes montre de façon générale que l'entrée somatosensorielle peut influencer des fonctions autonomes par des mécanismes spinaux et </w:t>
-      </w:r>
-      <w:proofErr w:type="spellStart"/>
-      <w:r>
-        <w:rPr>
-          <w:lang w:val="fr-FR"/>
-        </w:rPr>
-        <w:t>supraspinaux</w:t>
-      </w:r>
-      <w:proofErr w:type="spellEnd"/>
-      <w:r>
-        <w:rPr>
-          <w:lang w:val="fr-FR"/>
-        </w:rPr>
-        <w:t xml:space="preserve"> [48].</w:t>
-      </w:r>
-    </w:p>
-    <w:p>
-      <w:pPr>
-        <w:rPr>
-          <w:lang w:val="fr-FR"/>
-        </w:rPr>
-      </w:pPr>
-      <w:r>
-        <w:rPr>
-          <w:lang w:val="fr-FR"/>
-        </w:rPr>
-        <w:t>Pour la vessie, ce contrôle central est particulièrement bien décrit. Les informations viscérales et somatiques sont intégrées à plusieurs niveaux impliquant la substance grise périaqueducale, des centres pontiques, l'insula, le cortex cingulaire et les régions préfrontales ; ces réseaux participent à la perception de l'état viscéral, à l'attention, au contexte, à la décision et à la coordination des réponses autonomes et sphinctériennes [8,12,13].</w:t>
-      </w:r>
-    </w:p>
-    <w:p>
-      <w:pPr>
-        <w:rPr>
-          <w:lang w:val="fr-FR"/>
-        </w:rPr>
-      </w:pPr>
-      <w:r>
-        <w:rPr>
-          <w:lang w:val="fr-FR"/>
-        </w:rPr>
-        <w:t>Le terme « cerveau limbique » doit être utilisé avec prudence : il est préférable de nommer les structures ou les réseaux concernés plutôt que de suggérer l'existence d'un centre limbique unique de la R.O.P. Les réponses cérébrales observées lors de stimulations transcutanées tibiales et fibulaires ne sont d'ailleurs pas identiques [16] : plusieurs portes périphériques peuvent atteindre des réseaux centraux partiellement communs tout en conservant des profils différents.</w:t>
-      </w:r>
-    </w:p>
-    <w:p>
-      <w:pPr>
-        <w:rPr>
-          <w:lang w:val="fr-FR"/>
-        </w:rPr>
-      </w:pPr>
-      <w:r>
-        <w:rPr>
-          <w:lang w:val="fr-FR"/>
-        </w:rPr>
-        <w:t xml:space="preserve">Le principal enseignement du Pont 5 est méthodologique : l'absence de recouvrement radiculaire direct ne suffit pas à exclure un effet viscéral. En revanche, plus l'hypothèse dépend exclusivement de relais </w:t>
-      </w:r>
-      <w:proofErr w:type="spellStart"/>
-      <w:r>
-        <w:rPr>
-          <w:lang w:val="fr-FR"/>
-        </w:rPr>
-        <w:t>supraspinaux</w:t>
-      </w:r>
-      <w:proofErr w:type="spellEnd"/>
-      <w:r>
-        <w:rPr>
-          <w:lang w:val="fr-FR"/>
-        </w:rPr>
-        <w:t xml:space="preserve"> généraux, moins elle permet d'affirmer une spécificité régionale ou une correspondance point-organe.</w:t>
-      </w:r>
-    </w:p>
-    <w:p>
-      <w:pPr>
-        <w:spacing w:after="200"/>
-        <w:jc w:val="left"/>
-        <w:rPr>
-          <w:lang w:val="fr-FR"/>
-        </w:rPr>
-      </w:pPr>
-      <w:r>
-        <w:rPr>
-          <w:i/>
-          <w:color w:val="5A5A5A"/>
-          <w:sz w:val="18"/>
-          <w:lang w:val="fr-FR"/>
-        </w:rPr>
-        <w:t>FIGURE — existantes : pont-5-</w:t>
-      </w:r>
-      <w:proofErr w:type="gramStart"/>
-      <w:r>
-        <w:rPr>
-          <w:i/>
-          <w:color w:val="5A5A5A"/>
-          <w:sz w:val="18"/>
-          <w:lang w:val="fr-FR"/>
-        </w:rPr>
-        <w:t>schema.webp</w:t>
-      </w:r>
-      <w:proofErr w:type="gramEnd"/>
-      <w:r>
-        <w:rPr>
-          <w:i/>
-          <w:color w:val="5A5A5A"/>
-          <w:sz w:val="18"/>
-          <w:lang w:val="fr-FR"/>
-        </w:rPr>
-        <w:t xml:space="preserve"> et pont-5-</w:t>
-      </w:r>
-      <w:proofErr w:type="gramStart"/>
-      <w:r>
-        <w:rPr>
-          <w:i/>
-          <w:color w:val="5A5A5A"/>
-          <w:sz w:val="18"/>
-          <w:lang w:val="fr-FR"/>
-        </w:rPr>
-        <w:t>supraspinal.webp</w:t>
-      </w:r>
-      <w:proofErr w:type="gramEnd"/>
-      <w:r>
-        <w:rPr>
-          <w:i/>
-          <w:color w:val="5A5A5A"/>
-          <w:sz w:val="18"/>
-          <w:lang w:val="fr-FR"/>
-        </w:rPr>
-        <w:t>.</w:t>
+        <w:t>FIGURE — existantes : pont-5-schema.webp et pont-5-supraspinal.webp.</w:t>
       </w:r>
     </w:p>
     <w:p>
@@ -4141,7 +3958,6 @@
         <w:t>FIGURE — à produire : gradient à deux axes avec les quatre quadrants matérialisés et les cibles positionnées. Remplace gradient-deux-</w:t>
       </w:r>
       <w:proofErr w:type="spellStart"/>
-      <w:proofErr w:type="gramStart"/>
       <w:r>
         <w:rPr>
           <w:i/>
@@ -4152,7 +3968,6 @@
         <w:t>axes.webp</w:t>
       </w:r>
       <w:proofErr w:type="spellEnd"/>
-      <w:proofErr w:type="gramEnd"/>
       <w:r>
         <w:rPr>
           <w:i/>
@@ -4617,7 +4432,6 @@
         <w:t xml:space="preserve">FIGURE — existantes : </w:t>
       </w:r>
       <w:proofErr w:type="spellStart"/>
-      <w:proofErr w:type="gramStart"/>
       <w:r>
         <w:rPr>
           <w:i/>
@@ -4628,7 +4442,6 @@
         <w:t>pelvis.webp</w:t>
       </w:r>
       <w:proofErr w:type="spellEnd"/>
-      <w:proofErr w:type="gramEnd"/>
       <w:r>
         <w:rPr>
           <w:i/>
@@ -4639,7 +4452,6 @@
         <w:t xml:space="preserve"> et matrice-</w:t>
       </w:r>
       <w:proofErr w:type="spellStart"/>
-      <w:proofErr w:type="gramStart"/>
       <w:r>
         <w:rPr>
           <w:i/>
@@ -4650,7 +4462,6 @@
         <w:t>gradient.webp</w:t>
       </w:r>
       <w:proofErr w:type="spellEnd"/>
-      <w:proofErr w:type="gramEnd"/>
       <w:r>
         <w:rPr>
           <w:i/>
@@ -5490,21 +5301,7 @@
         <w:rPr>
           <w:lang w:val="fr-FR"/>
         </w:rPr>
-        <w:t xml:space="preserve"> appliquée sur quatre territoires podaux distincts produit-elle des profils de réponse différents ? </w:t>
-      </w:r>
-      <w:proofErr w:type="gramStart"/>
-      <w:r>
-        <w:rPr>
-          <w:lang w:val="fr-FR"/>
-        </w:rPr>
-        <w:t>Une gradation tibial</w:t>
-      </w:r>
-      <w:proofErr w:type="gramEnd"/>
-      <w:r>
-        <w:rPr>
-          <w:lang w:val="fr-FR"/>
-        </w:rPr>
-        <w:t xml:space="preserve"> &gt; sural/fibulaire &gt; saphène soutiendrait une contribution segmentaire ; une réponse comparable des quatre portes confirmerait la prééminence des mécanismes centraux [1,16].</w:t>
+        <w:t xml:space="preserve"> appliquée sur quatre territoires podaux distincts produit-elle des profils de réponse différents ? Une gradation tibial &gt; sural/fibulaire &gt; saphène soutiendrait une contribution segmentaire ; une réponse comparable des quatre portes confirmerait la prééminence des mécanismes centraux [1,16].</w:t>
       </w:r>
     </w:p>
     <w:p>
@@ -6989,55 +6786,7 @@
           <w:sz w:val="18"/>
           <w:lang w:val="fr-FR"/>
         </w:rPr>
-        <w:t xml:space="preserve">. </w:t>
-      </w:r>
-      <w:proofErr w:type="gramStart"/>
-      <w:r>
-        <w:rPr>
-          <w:sz w:val="18"/>
-          <w:lang w:val="fr-FR"/>
-        </w:rPr>
-        <w:t>2018;</w:t>
-      </w:r>
-      <w:proofErr w:type="gramEnd"/>
-      <w:r>
-        <w:rPr>
-          <w:sz w:val="18"/>
-          <w:lang w:val="fr-FR"/>
-        </w:rPr>
-        <w:t>120(3</w:t>
-      </w:r>
-      <w:proofErr w:type="gramStart"/>
-      <w:r>
-        <w:rPr>
-          <w:sz w:val="18"/>
-          <w:lang w:val="fr-FR"/>
-        </w:rPr>
-        <w:t>):</w:t>
-      </w:r>
-      <w:proofErr w:type="gramEnd"/>
-      <w:r>
-        <w:rPr>
-          <w:sz w:val="18"/>
-          <w:lang w:val="fr-FR"/>
-        </w:rPr>
-        <w:t xml:space="preserve">1233–1246. </w:t>
-      </w:r>
-      <w:proofErr w:type="gramStart"/>
-      <w:r>
-        <w:rPr>
-          <w:sz w:val="18"/>
-          <w:lang w:val="fr-FR"/>
-        </w:rPr>
-        <w:t>doi:</w:t>
-      </w:r>
-      <w:proofErr w:type="gramEnd"/>
-      <w:r>
-        <w:rPr>
-          <w:sz w:val="18"/>
-          <w:lang w:val="fr-FR"/>
-        </w:rPr>
-        <w:t>10.1152/jn.00848.2017.</w:t>
+        <w:t>. 2018;120(3):1233–1246. doi:10.1152/jn.00848.2017.</w:t>
       </w:r>
     </w:p>
     <w:p>
@@ -7210,55 +6959,7 @@
           <w:sz w:val="18"/>
           <w:lang w:val="fr-FR"/>
         </w:rPr>
-        <w:t xml:space="preserve"> ONE. </w:t>
-      </w:r>
-      <w:proofErr w:type="gramStart"/>
-      <w:r>
-        <w:rPr>
-          <w:sz w:val="18"/>
-          <w:lang w:val="fr-FR"/>
-        </w:rPr>
-        <w:t>2024;</w:t>
-      </w:r>
-      <w:proofErr w:type="gramEnd"/>
-      <w:r>
-        <w:rPr>
-          <w:sz w:val="18"/>
-          <w:lang w:val="fr-FR"/>
-        </w:rPr>
-        <w:t>19(2</w:t>
-      </w:r>
-      <w:proofErr w:type="gramStart"/>
-      <w:r>
-        <w:rPr>
-          <w:sz w:val="18"/>
-          <w:lang w:val="fr-FR"/>
-        </w:rPr>
-        <w:t>):e</w:t>
-      </w:r>
-      <w:proofErr w:type="gramEnd"/>
-      <w:r>
-        <w:rPr>
-          <w:sz w:val="18"/>
-          <w:lang w:val="fr-FR"/>
-        </w:rPr>
-        <w:t xml:space="preserve">0297680. </w:t>
-      </w:r>
-      <w:proofErr w:type="gramStart"/>
-      <w:r>
-        <w:rPr>
-          <w:sz w:val="18"/>
-          <w:lang w:val="fr-FR"/>
-        </w:rPr>
-        <w:t>doi:10.1371/journal.pone</w:t>
-      </w:r>
-      <w:proofErr w:type="gramEnd"/>
-      <w:r>
-        <w:rPr>
-          <w:sz w:val="18"/>
-          <w:lang w:val="fr-FR"/>
-        </w:rPr>
-        <w:t>.0297680.</w:t>
+        <w:t xml:space="preserve"> ONE. 2024;19(2):e0297680. doi:10.1371/journal.pone.0297680.</w:t>
       </w:r>
     </w:p>
     <w:p>
@@ -7416,39 +7117,7 @@
           <w:sz w:val="18"/>
           <w:lang w:val="fr-FR"/>
         </w:rPr>
-        <w:t xml:space="preserve">. </w:t>
-      </w:r>
-      <w:proofErr w:type="gramStart"/>
-      <w:r>
-        <w:rPr>
-          <w:sz w:val="18"/>
-          <w:lang w:val="fr-FR"/>
-        </w:rPr>
-        <w:t>2026;265:</w:t>
-      </w:r>
-      <w:proofErr w:type="gramEnd"/>
-      <w:r>
-        <w:rPr>
-          <w:sz w:val="18"/>
-          <w:lang w:val="fr-FR"/>
-        </w:rPr>
-        <w:t xml:space="preserve">103413. </w:t>
-      </w:r>
-      <w:proofErr w:type="gramStart"/>
-      <w:r>
-        <w:rPr>
-          <w:sz w:val="18"/>
-          <w:lang w:val="fr-FR"/>
-        </w:rPr>
-        <w:t>doi:10.1016/j.autneu</w:t>
-      </w:r>
-      <w:proofErr w:type="gramEnd"/>
-      <w:r>
-        <w:rPr>
-          <w:sz w:val="18"/>
-          <w:lang w:val="fr-FR"/>
-        </w:rPr>
-        <w:t>.2026.103413.</w:t>
+        <w:t>. 2026;265:103413. doi:10.1016/j.autneu.2026.103413.</w:t>
       </w:r>
     </w:p>
     <w:p>
@@ -7586,39 +7255,7 @@
           <w:sz w:val="18"/>
           <w:lang w:val="fr-FR"/>
         </w:rPr>
-        <w:t xml:space="preserve">. </w:t>
-      </w:r>
-      <w:proofErr w:type="gramStart"/>
-      <w:r>
-        <w:rPr>
-          <w:sz w:val="18"/>
-          <w:lang w:val="fr-FR"/>
-        </w:rPr>
-        <w:t>2020;226:</w:t>
-      </w:r>
-      <w:proofErr w:type="gramEnd"/>
-      <w:r>
-        <w:rPr>
-          <w:sz w:val="18"/>
-          <w:lang w:val="fr-FR"/>
-        </w:rPr>
-        <w:t xml:space="preserve">102672. </w:t>
-      </w:r>
-      <w:proofErr w:type="gramStart"/>
-      <w:r>
-        <w:rPr>
-          <w:sz w:val="18"/>
-          <w:lang w:val="fr-FR"/>
-        </w:rPr>
-        <w:t>doi:10.1016/j.autneu</w:t>
-      </w:r>
-      <w:proofErr w:type="gramEnd"/>
-      <w:r>
-        <w:rPr>
-          <w:sz w:val="18"/>
-          <w:lang w:val="fr-FR"/>
-        </w:rPr>
-        <w:t>.2020.102672.</w:t>
+        <w:t>. 2020;226:102672. doi:10.1016/j.autneu.2020.102672.</w:t>
       </w:r>
     </w:p>
     <w:p>
@@ -7674,39 +7311,7 @@
           <w:sz w:val="18"/>
           <w:lang w:val="fr-FR"/>
         </w:rPr>
-        <w:t xml:space="preserve">Conf Proc IEEE Eng Med Biol Soc. </w:t>
-      </w:r>
-      <w:proofErr w:type="gramStart"/>
-      <w:r>
-        <w:rPr>
-          <w:sz w:val="18"/>
-          <w:lang w:val="fr-FR"/>
-        </w:rPr>
-        <w:t>2016:</w:t>
-      </w:r>
-      <w:proofErr w:type="gramEnd"/>
-      <w:r>
-        <w:rPr>
-          <w:sz w:val="18"/>
-          <w:lang w:val="fr-FR"/>
-        </w:rPr>
-        <w:t xml:space="preserve">3129–3132. </w:t>
-      </w:r>
-      <w:proofErr w:type="gramStart"/>
-      <w:r>
-        <w:rPr>
-          <w:sz w:val="18"/>
-          <w:lang w:val="fr-FR"/>
-        </w:rPr>
-        <w:t>doi:</w:t>
-      </w:r>
-      <w:proofErr w:type="gramEnd"/>
-      <w:r>
-        <w:rPr>
-          <w:sz w:val="18"/>
-          <w:lang w:val="fr-FR"/>
-        </w:rPr>
-        <w:t>10.1109/EMBC.2016.7591392.</w:t>
+        <w:t>Conf Proc IEEE Eng Med Biol Soc. 2016:3129–3132. doi:10.1109/EMBC.2016.7591392.</w:t>
       </w:r>
     </w:p>
     <w:p>
@@ -7767,21 +7372,7 @@
         <w:rPr>
           <w:sz w:val="18"/>
         </w:rPr>
-        <w:t xml:space="preserve">J Urol. 2009;182(3):1055–1061. </w:t>
-      </w:r>
-      <w:proofErr w:type="gramStart"/>
-      <w:r>
-        <w:rPr>
-          <w:sz w:val="18"/>
-        </w:rPr>
-        <w:t>doi:10.1016/j.juro</w:t>
-      </w:r>
-      <w:proofErr w:type="gramEnd"/>
-      <w:r>
-        <w:rPr>
-          <w:sz w:val="18"/>
-        </w:rPr>
-        <w:t>.2009.05.045.</w:t>
+        <w:t>J Urol. 2009;182(3):1055–1061. doi:10.1016/j.juro.2009.05.045.</w:t>
       </w:r>
     </w:p>
     <w:p>
@@ -7946,23 +7537,7 @@
           <w:sz w:val="18"/>
           <w:lang w:val="fr-FR"/>
         </w:rPr>
-        <w:t xml:space="preserve"> J. 2026. </w:t>
-      </w:r>
-      <w:proofErr w:type="gramStart"/>
-      <w:r>
-        <w:rPr>
-          <w:sz w:val="18"/>
-          <w:lang w:val="fr-FR"/>
-        </w:rPr>
-        <w:t>doi:</w:t>
-      </w:r>
-      <w:proofErr w:type="gramEnd"/>
-      <w:r>
-        <w:rPr>
-          <w:sz w:val="18"/>
-          <w:lang w:val="fr-FR"/>
-        </w:rPr>
-        <w:t>10.1007/s00192-026-06564-0.</w:t>
+        <w:t xml:space="preserve"> J. 2026. doi:10.1007/s00192-026-06564-0.</w:t>
       </w:r>
     </w:p>
     <w:p>
@@ -8061,21 +7636,7 @@
         <w:rPr>
           <w:sz w:val="18"/>
         </w:rPr>
-        <w:t xml:space="preserve">Neuroscience. 2007;149(3):660–672. </w:t>
-      </w:r>
-      <w:proofErr w:type="gramStart"/>
-      <w:r>
-        <w:rPr>
-          <w:sz w:val="18"/>
-        </w:rPr>
-        <w:t>doi:10.1016/j.neuroscience</w:t>
-      </w:r>
-      <w:proofErr w:type="gramEnd"/>
-      <w:r>
-        <w:rPr>
-          <w:sz w:val="18"/>
-        </w:rPr>
-        <w:t>.2007.07.053.</w:t>
+        <w:t>Neuroscience. 2007;149(3):660–672. doi:10.1016/j.neuroscience.2007.07.053.</w:t>
       </w:r>
     </w:p>
     <w:p>
@@ -8437,55 +7998,7 @@
           <w:sz w:val="18"/>
           <w:lang w:val="fr-FR"/>
         </w:rPr>
-        <w:t xml:space="preserve">. </w:t>
-      </w:r>
-      <w:proofErr w:type="gramStart"/>
-      <w:r>
-        <w:rPr>
-          <w:sz w:val="18"/>
-          <w:lang w:val="fr-FR"/>
-        </w:rPr>
-        <w:t>1984;356:</w:t>
-      </w:r>
-      <w:proofErr w:type="gramEnd"/>
-      <w:r>
-        <w:rPr>
-          <w:sz w:val="18"/>
-          <w:lang w:val="fr-FR"/>
-        </w:rPr>
-        <w:t xml:space="preserve">1–7. </w:t>
-      </w:r>
-      <w:proofErr w:type="gramStart"/>
-      <w:r>
-        <w:rPr>
-          <w:sz w:val="18"/>
-          <w:lang w:val="fr-FR"/>
-        </w:rPr>
-        <w:t>doi:</w:t>
-      </w:r>
-      <w:proofErr w:type="gramEnd"/>
-      <w:r>
-        <w:rPr>
-          <w:sz w:val="18"/>
-          <w:lang w:val="fr-FR"/>
-        </w:rPr>
-        <w:t>10.1113/</w:t>
-      </w:r>
-      <w:proofErr w:type="gramStart"/>
-      <w:r>
-        <w:rPr>
-          <w:sz w:val="18"/>
-          <w:lang w:val="fr-FR"/>
-        </w:rPr>
-        <w:t>jphysiol.1984.sp</w:t>
-      </w:r>
-      <w:proofErr w:type="gramEnd"/>
-      <w:r>
-        <w:rPr>
-          <w:sz w:val="18"/>
-          <w:lang w:val="fr-FR"/>
-        </w:rPr>
-        <w:t>015448.</w:t>
+        <w:t>. 1984;356:1–7. doi:10.1113/jphysiol.1984.sp015448.</w:t>
       </w:r>
     </w:p>
     <w:p>
@@ -8590,39 +8103,7 @@
           <w:sz w:val="18"/>
           <w:lang w:val="fr-FR"/>
         </w:rPr>
-        <w:t xml:space="preserve">. </w:t>
-      </w:r>
-      <w:proofErr w:type="gramStart"/>
-      <w:r>
-        <w:rPr>
-          <w:sz w:val="18"/>
-          <w:lang w:val="fr-FR"/>
-        </w:rPr>
-        <w:t>2016;10:</w:t>
-      </w:r>
-      <w:proofErr w:type="gramEnd"/>
-      <w:r>
-        <w:rPr>
-          <w:sz w:val="18"/>
-          <w:lang w:val="fr-FR"/>
-        </w:rPr>
-        <w:t xml:space="preserve">568. </w:t>
-      </w:r>
-      <w:proofErr w:type="gramStart"/>
-      <w:r>
-        <w:rPr>
-          <w:sz w:val="18"/>
-          <w:lang w:val="fr-FR"/>
-        </w:rPr>
-        <w:t>doi:</w:t>
-      </w:r>
-      <w:proofErr w:type="gramEnd"/>
-      <w:r>
-        <w:rPr>
-          <w:sz w:val="18"/>
-          <w:lang w:val="fr-FR"/>
-        </w:rPr>
-        <w:t>10.3389/fnins.2016.00568.</w:t>
+        <w:t>. 2016;10:568. doi:10.3389/fnins.2016.00568.</w:t>
       </w:r>
     </w:p>
     <w:p>

</xml_diff>